<commit_message>
Fix agreement footer fields and numbering
</commit_message>
<xml_diff>
--- a/front/public/Agreement-Template.docx
+++ b/front/public/Agreement-Template.docx
@@ -6632,7 +6632,7 @@
 </file>
 
 <file path=word/footer1.xml><?xml version="1.0" encoding="utf-8"?>
-<w:ftr xmlns:wpc="http://schemas.microsoft.com/office/word/2010/wordprocessingCanvas" xmlns:cx="http://schemas.microsoft.com/office/drawing/2014/chartex" xmlns:cx1="http://schemas.microsoft.com/office/drawing/2015/9/8/chartex" xmlns:cx2="http://schemas.microsoft.com/office/drawing/2015/10/21/chartex" xmlns:cx3="http://schemas.microsoft.com/office/drawing/2016/5/9/chartex" xmlns:cx4="http://schemas.microsoft.com/office/drawing/2016/5/10/chartex" xmlns:cx5="http://schemas.microsoft.com/office/drawing/2016/5/11/chartex" xmlns:cx6="http://schemas.microsoft.com/office/drawing/2016/5/12/chartex" xmlns:cx7="http://schemas.microsoft.com/office/drawing/2016/5/13/chartex" xmlns:cx8="http://schemas.microsoft.com/office/drawing/2016/5/14/chartex" xmlns:mc="http://schemas.openxmlformats.org/markup-compatibility/2006" xmlns:aink="http://schemas.microsoft.com/office/drawing/2016/ink" xmlns:am3d="http://schemas.microsoft.com/office/drawing/2017/model3d" xmlns:o="urn:schemas-microsoft-com:office:office" xmlns:oel="http://schemas.microsoft.com/office/2019/extlst" xmlns:r="http://schemas.openxmlformats.org/officeDocument/2006/relationships" xmlns:m="http://schemas.openxmlformats.org/officeDocument/2006/math" xmlns:v="urn:schemas-microsoft-com:vml" xmlns:wp14="http://schemas.microsoft.com/office/word/2010/wordprocessingDrawing" xmlns:wp="http://schemas.openxmlformats.org/drawingml/2006/wordprocessingDrawing" xmlns:w10="urn:schemas-microsoft-com:office:word" xmlns:w="http://schemas.openxmlformats.org/wordprocessingml/2006/main" xmlns:w14="http://schemas.microsoft.com/office/word/2010/wordml" xmlns:w15="http://schemas.microsoft.com/office/word/2012/wordml" xmlns:w16cex="http://schemas.microsoft.com/office/word/2018/wordml/cex" xmlns:w16cid="http://schemas.microsoft.com/office/word/2016/wordml/cid" xmlns:w16="http://schemas.microsoft.com/office/word/2018/wordml" xmlns:w16du="http://schemas.microsoft.com/office/word/2023/wordml/word16du" xmlns:w16sdtdh="http://schemas.microsoft.com/office/word/2020/wordml/sdtdatahash" xmlns:w16sdtfl="http://schemas.microsoft.com/office/word/2024/wordml/sdtformatlock" xmlns:w16se="http://schemas.microsoft.com/office/word/2015/wordml/symex" xmlns:wpg="http://schemas.microsoft.com/office/word/2010/wordprocessingGroup" xmlns:wpi="http://schemas.microsoft.com/office/word/2010/wordprocessingInk" xmlns:wne="http://schemas.microsoft.com/office/word/2006/wordml" xmlns:wps="http://schemas.microsoft.com/office/word/2010/wordprocessingShape" mc:Ignorable="w14 w15 w16se w16cid w16 w16cex w16sdtdh w16sdtfl w16du wp14">
+<w:ftr xmlns:ns1="http://schemas.openxmlformats.org/markup-compatibility/2006" xmlns:ns2="http://schemas.microsoft.com/office/word/2010/wordml" xmlns:ns3="http://schemas.openxmlformats.org/drawingml/2006/wordprocessingDrawing" xmlns:ns4="http://schemas.microsoft.com/office/word/2010/wordprocessingDrawing" xmlns:ns5="http://schemas.openxmlformats.org/drawingml/2006/main" xmlns:ns6="http://schemas.microsoft.com/office/word/2010/wordprocessingShape" xmlns:ns7="urn:schemas-microsoft-com:vml" xmlns:ns8="urn:schemas-microsoft-com:office:office" xmlns:ns9="urn:schemas-microsoft-com:office:word" xmlns:w="http://schemas.openxmlformats.org/wordprocessingml/2006/main" ns1:Ignorable="w14 w15 w16se w16cid w16 w16cex w16sdtdh w16sdtfl w16du wp14">
   <w:sdt>
     <w:sdtPr>
       <w:id w:val="1154575188"/>
@@ -6651,7 +6651,7 @@
           </w:docPartObj>
         </w:sdtPr>
         <w:sdtContent>
-          <w:p>
+          <w:p ns2:paraId="1806E659" ns2:textId="357C100A">
             <w:pPr>
               <w:pStyle w:val="Footer"/>
               <w:jc w:val="center"/>
@@ -6660,51 +6660,51 @@
               <w:rPr>
                 <w:noProof/>
               </w:rPr>
-              <mc:AlternateContent>
-                <mc:Choice Requires="wps">
+              <ns1:AlternateContent>
+                <ns1:Choice Requires="wps">
                   <w:drawing>
-                    <wp:anchor distT="45720" distB="45720" distL="114300" distR="114300" simplePos="0" relativeHeight="251660293" behindDoc="0" locked="0" layoutInCell="1" allowOverlap="1" wp14:anchorId="1C3CDF6A" wp14:editId="6653A74B">
-                      <wp:simplePos x="0" y="0"/>
-                      <wp:positionH relativeFrom="column">
-                        <wp:posOffset>3778885</wp:posOffset>
-                      </wp:positionH>
-                      <wp:positionV relativeFrom="paragraph">
-                        <wp:posOffset>-53340</wp:posOffset>
-                      </wp:positionV>
-                      <wp:extent cx="1651000" cy="222250"/>
-                      <wp:effectExtent l="0" t="0" r="6350" b="6350"/>
-                      <wp:wrapNone/>
-                      <wp:docPr id="824550277" name="Text Box 2"/>
-                      <wp:cNvGraphicFramePr>
-                        <a:graphicFrameLocks xmlns:a="http://schemas.openxmlformats.org/drawingml/2006/main"/>
-                      </wp:cNvGraphicFramePr>
-                      <a:graphic xmlns:a="http://schemas.openxmlformats.org/drawingml/2006/main">
-                        <a:graphicData uri="http://schemas.microsoft.com/office/word/2010/wordprocessingShape">
-                          <wps:wsp>
-                            <wps:cNvSpPr txBox="1">
-                              <a:spLocks noChangeArrowheads="1"/>
-                            </wps:cNvSpPr>
-                            <wps:spPr bwMode="auto">
-                              <a:xfrm>
-                                <a:off x="0" y="0"/>
-                                <a:ext cx="1651000" cy="222250"/>
-                              </a:xfrm>
-                              <a:prstGeom prst="rect">
-                                <a:avLst/>
-                              </a:prstGeom>
-                              <a:solidFill>
-                                <a:srgbClr val="FFFFFF"/>
-                              </a:solidFill>
-                              <a:ln w="9525">
-                                <a:noFill/>
-                                <a:miter lim="800000"/>
-                                <a:headEnd/>
-                                <a:tailEnd/>
-                              </a:ln>
-                            </wps:spPr>
-                            <wps:txbx>
+                    <ns3:anchor distT="45720" distB="45720" distL="114300" distR="114300" simplePos="0" relativeHeight="251660293" behindDoc="0" locked="0" layoutInCell="1" allowOverlap="1" ns4:anchorId="1C3CDF6A" ns4:editId="6653A74B">
+                      <ns3:simplePos x="0" y="0"/>
+                      <ns3:positionH relativeFrom="column">
+                        <ns3:posOffset>3778885</ns3:posOffset>
+                      </ns3:positionH>
+                      <ns3:positionV relativeFrom="paragraph">
+                        <ns3:posOffset>-53340</ns3:posOffset>
+                      </ns3:positionV>
+                      <ns3:extent cx="1651000" cy="222250"/>
+                      <ns3:effectExtent l="0" t="0" r="6350" b="6350"/>
+                      <ns3:wrapNone/>
+                      <ns3:docPr id="824550277" name="Text Box 2"/>
+                      <ns3:cNvGraphicFramePr>
+                        <ns5:graphicFrameLocks/>
+                      </ns3:cNvGraphicFramePr>
+                      <ns5:graphic>
+                        <ns5:graphicData uri="http://schemas.microsoft.com/office/word/2010/wordprocessingShape">
+                          <ns6:wsp>
+                            <ns6:cNvSpPr txBox="1">
+                              <ns5:spLocks noChangeArrowheads="1"/>
+                            </ns6:cNvSpPr>
+                            <ns6:spPr bwMode="auto">
+                              <ns5:xfrm>
+                                <ns5:off x="0" y="0"/>
+                                <ns5:ext cx="1651000" cy="222250"/>
+                              </ns5:xfrm>
+                              <ns5:prstGeom prst="rect">
+                                <ns5:avLst/>
+                              </ns5:prstGeom>
+                              <ns5:solidFill>
+                                <ns5:srgbClr val="FFFFFF"/>
+                              </ns5:solidFill>
+                              <ns5:ln w="9525">
+                                <ns5:noFill/>
+                                <ns5:miter lim="800000"/>
+                                <ns5:headEnd/>
+                                <ns5:tailEnd/>
+                              </ns5:ln>
+                            </ns6:spPr>
+                            <ns6:txbx>
                               <w:txbxContent>
-                                <w:p>
+                                <w:p ns2:paraId="31CC7A04" ns2:textId="77777777">
                                   <w:pPr>
                                     <w:rPr>
                                       <w:sz w:val="16"/>
@@ -6728,7 +6728,7 @@
                                       <w:szCs w:val="16"/>
                                       <w:highlight w:val="yellow"/>
                                     </w:rPr>
-                                    <w:t xml:space="preserve">Variable </w:t>
+                                    <w:t xml:space="preserve">[Hostel Email]</w:t>
                                   </w:r>
                                   <w:r>
                                     <w:rPr>
@@ -6738,7 +6738,7 @@
                                       <w:szCs w:val="16"/>
                                       <w:highlight w:val="yellow"/>
                                     </w:rPr>
-                                    <w:t>1</w:t>
+                                    <w:t/>
                                   </w:r>
                                   <w:r>
                                     <w:rPr>
@@ -6748,36 +6748,36 @@
                                       <w:szCs w:val="16"/>
                                       <w:highlight w:val="yellow"/>
                                     </w:rPr>
-                                    <w:t>2</w:t>
+                                    <w:t/>
                                   </w:r>
                                 </w:p>
                               </w:txbxContent>
-                            </wps:txbx>
-                            <wps:bodyPr rot="0" vert="horz" wrap="square" lIns="91440" tIns="45720" rIns="91440" bIns="45720" anchor="t" anchorCtr="0">
-                              <a:noAutofit/>
-                            </wps:bodyPr>
-                          </wps:wsp>
-                        </a:graphicData>
-                      </a:graphic>
-                      <wp14:sizeRelH relativeFrom="margin">
-                        <wp14:pctWidth>0</wp14:pctWidth>
-                      </wp14:sizeRelH>
-                      <wp14:sizeRelV relativeFrom="margin">
-                        <wp14:pctHeight>0</wp14:pctHeight>
-                      </wp14:sizeRelV>
-                    </wp:anchor>
+                            </ns6:txbx>
+                            <ns6:bodyPr rot="0" vert="horz" wrap="square" lIns="91440" tIns="45720" rIns="91440" bIns="45720" anchor="t" anchorCtr="0">
+                              <ns5:noAutofit/>
+                            </ns6:bodyPr>
+                          </ns6:wsp>
+                        </ns5:graphicData>
+                      </ns5:graphic>
+                      <ns4:sizeRelH relativeFrom="margin">
+                        <ns4:pctWidth>0</ns4:pctWidth>
+                      </ns4:sizeRelH>
+                      <ns4:sizeRelV relativeFrom="margin">
+                        <ns4:pctHeight>0</ns4:pctHeight>
+                      </ns4:sizeRelV>
+                    </ns3:anchor>
                   </w:drawing>
-                </mc:Choice>
-                <mc:Fallback>
+                </ns1:Choice>
+                <ns1:Fallback>
                   <w:pict>
-                    <v:shapetype w14:anchorId="1C3CDF6A" id="_x0000_t202" coordsize="21600,21600" o:spt="202" path="m,l,21600r21600,l21600,xe">
-                      <v:stroke joinstyle="miter"/>
-                      <v:path gradientshapeok="t" o:connecttype="rect"/>
-                    </v:shapetype>
-                    <v:shape id="_x0000_s1028" type="#_x0000_t202" style="position:absolute;left:0;text-align:left;margin-left:297.55pt;margin-top:-4.2pt;width:130pt;height:17.5pt;z-index:251660293;visibility:visible;mso-wrap-style:square;mso-width-percent:0;mso-height-percent:0;mso-wrap-distance-left:9pt;mso-wrap-distance-top:3.6pt;mso-wrap-distance-right:9pt;mso-wrap-distance-bottom:3.6pt;mso-position-horizontal:absolute;mso-position-horizontal-relative:text;mso-position-vertical:absolute;mso-position-vertical-relative:text;mso-width-percent:0;mso-height-percent:0;mso-width-relative:margin;mso-height-relative:margin;v-text-anchor:top" o:gfxdata="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" stroked="f">
-                      <v:textbox>
+                    <ns7:shapetype ns2:anchorId="1C3CDF6A" id="_x0000_t202" coordsize="21600,21600" ns8:spt="202" path="m,l,21600r21600,l21600,xe">
+                      <ns7:stroke joinstyle="miter"/>
+                      <ns7:path gradientshapeok="t" ns8:connecttype="rect"/>
+                    </ns7:shapetype>
+                    <ns7:shape id="_x0000_s1028" type="#_x0000_t202" style="position:absolute;left:0;text-align:left;margin-left:297.55pt;margin-top:-4.2pt;width:130pt;height:17.5pt;z-index:251660293;visibility:visible;mso-wrap-style:square;mso-width-percent:0;mso-height-percent:0;mso-wrap-distance-left:9pt;mso-wrap-distance-top:3.6pt;mso-wrap-distance-right:9pt;mso-wrap-distance-bottom:3.6pt;mso-position-horizontal:absolute;mso-position-horizontal-relative:text;mso-position-vertical:absolute;mso-position-vertical-relative:text;mso-width-percent:0;mso-height-percent:0;mso-width-relative:margin;mso-height-relative:margin;v-text-anchor:top" ns8:gfxdata="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" stroked="f">
+                      <ns7:textbox>
                         <w:txbxContent>
-                          <w:p>
+                          <w:p ns2:paraId="31CC7A04" ns2:textId="77777777">
                             <w:pPr>
                               <w:rPr>
                                 <w:sz w:val="16"/>
@@ -6801,7 +6801,7 @@
                                 <w:szCs w:val="16"/>
                                 <w:highlight w:val="yellow"/>
                               </w:rPr>
-                              <w:t xml:space="preserve">Variable </w:t>
+                              <w:t xml:space="preserve">[Hostel Email]</w:t>
                             </w:r>
                             <w:r>
                               <w:rPr>
@@ -6811,7 +6811,7 @@
                                 <w:szCs w:val="16"/>
                                 <w:highlight w:val="yellow"/>
                               </w:rPr>
-                              <w:t>1</w:t>
+                              <w:t/>
                             </w:r>
                             <w:r>
                               <w:rPr>
@@ -6821,65 +6821,65 @@
                                 <w:szCs w:val="16"/>
                                 <w:highlight w:val="yellow"/>
                               </w:rPr>
-                              <w:t>2</w:t>
+                              <w:t/>
                             </w:r>
                           </w:p>
                         </w:txbxContent>
-                      </v:textbox>
-                    </v:shape>
+                      </ns7:textbox>
+                    </ns7:shape>
                   </w:pict>
-                </mc:Fallback>
-              </mc:AlternateContent>
+                </ns1:Fallback>
+              </ns1:AlternateContent>
             </w:r>
             <w:r>
               <w:rPr>
                 <w:noProof/>
               </w:rPr>
-              <mc:AlternateContent>
-                <mc:Choice Requires="wps">
+              <ns1:AlternateContent>
+                <ns1:Choice Requires="wps">
                   <w:drawing>
-                    <wp:anchor distT="45720" distB="45720" distL="114300" distR="114300" simplePos="0" relativeHeight="251661317" behindDoc="0" locked="0" layoutInCell="1" allowOverlap="1" wp14:anchorId="3245D485" wp14:editId="3BF6B7DA">
-                      <wp:simplePos x="0" y="0"/>
-                      <wp:positionH relativeFrom="margin">
-                        <wp:posOffset>29210</wp:posOffset>
-                      </wp:positionH>
-                      <wp:positionV relativeFrom="paragraph">
-                        <wp:posOffset>-64135</wp:posOffset>
-                      </wp:positionV>
-                      <wp:extent cx="1651000" cy="222250"/>
-                      <wp:effectExtent l="0" t="0" r="6350" b="6350"/>
-                      <wp:wrapNone/>
-                      <wp:docPr id="1611662548" name="Text Box 2"/>
-                      <wp:cNvGraphicFramePr>
-                        <a:graphicFrameLocks xmlns:a="http://schemas.openxmlformats.org/drawingml/2006/main"/>
-                      </wp:cNvGraphicFramePr>
-                      <a:graphic xmlns:a="http://schemas.openxmlformats.org/drawingml/2006/main">
-                        <a:graphicData uri="http://schemas.microsoft.com/office/word/2010/wordprocessingShape">
-                          <wps:wsp>
-                            <wps:cNvSpPr txBox="1">
-                              <a:spLocks noChangeArrowheads="1"/>
-                            </wps:cNvSpPr>
-                            <wps:spPr bwMode="auto">
-                              <a:xfrm>
-                                <a:off x="0" y="0"/>
-                                <a:ext cx="1651000" cy="222250"/>
-                              </a:xfrm>
-                              <a:prstGeom prst="rect">
-                                <a:avLst/>
-                              </a:prstGeom>
-                              <a:solidFill>
-                                <a:srgbClr val="FFFFFF"/>
-                              </a:solidFill>
-                              <a:ln w="9525">
-                                <a:noFill/>
-                                <a:miter lim="800000"/>
-                                <a:headEnd/>
-                                <a:tailEnd/>
-                              </a:ln>
-                            </wps:spPr>
-                            <wps:txbx>
+                    <ns3:anchor distT="45720" distB="45720" distL="114300" distR="114300" simplePos="0" relativeHeight="251661317" behindDoc="0" locked="0" layoutInCell="1" allowOverlap="1" ns4:anchorId="3245D485" ns4:editId="3BF6B7DA">
+                      <ns3:simplePos x="0" y="0"/>
+                      <ns3:positionH relativeFrom="margin">
+                        <ns3:posOffset>29210</ns3:posOffset>
+                      </ns3:positionH>
+                      <ns3:positionV relativeFrom="paragraph">
+                        <ns3:posOffset>-64135</ns3:posOffset>
+                      </ns3:positionV>
+                      <ns3:extent cx="1651000" cy="222250"/>
+                      <ns3:effectExtent l="0" t="0" r="6350" b="6350"/>
+                      <ns3:wrapNone/>
+                      <ns3:docPr id="1611662548" name="Text Box 2"/>
+                      <ns3:cNvGraphicFramePr>
+                        <ns5:graphicFrameLocks/>
+                      </ns3:cNvGraphicFramePr>
+                      <ns5:graphic>
+                        <ns5:graphicData uri="http://schemas.microsoft.com/office/word/2010/wordprocessingShape">
+                          <ns6:wsp>
+                            <ns6:cNvSpPr txBox="1">
+                              <ns5:spLocks noChangeArrowheads="1"/>
+                            </ns6:cNvSpPr>
+                            <ns6:spPr bwMode="auto">
+                              <ns5:xfrm>
+                                <ns5:off x="0" y="0"/>
+                                <ns5:ext cx="1651000" cy="222250"/>
+                              </ns5:xfrm>
+                              <ns5:prstGeom prst="rect">
+                                <ns5:avLst/>
+                              </ns5:prstGeom>
+                              <ns5:solidFill>
+                                <ns5:srgbClr val="FFFFFF"/>
+                              </ns5:solidFill>
+                              <ns5:ln w="9525">
+                                <ns5:noFill/>
+                                <ns5:miter lim="800000"/>
+                                <ns5:headEnd/>
+                                <ns5:tailEnd/>
+                              </ns5:ln>
+                            </ns6:spPr>
+                            <ns6:txbx>
                               <w:txbxContent>
-                                <w:p>
+                                <w:p ns2:paraId="0C71AE25" ns2:textId="77777777">
                                   <w:pPr>
                                     <w:rPr>
                                       <w:b/>
@@ -6905,32 +6905,32 @@
                                       <w:szCs w:val="16"/>
                                       <w:highlight w:val="yellow"/>
                                     </w:rPr>
-                                    <w:t>Variable 11</w:t>
+                                    <w:t>[Hostel Telephone]</w:t>
                                   </w:r>
                                 </w:p>
                               </w:txbxContent>
-                            </wps:txbx>
-                            <wps:bodyPr rot="0" vert="horz" wrap="square" lIns="91440" tIns="45720" rIns="91440" bIns="45720" anchor="t" anchorCtr="0">
-                              <a:noAutofit/>
-                            </wps:bodyPr>
-                          </wps:wsp>
-                        </a:graphicData>
-                      </a:graphic>
-                      <wp14:sizeRelH relativeFrom="margin">
-                        <wp14:pctWidth>0</wp14:pctWidth>
-                      </wp14:sizeRelH>
-                      <wp14:sizeRelV relativeFrom="margin">
-                        <wp14:pctHeight>0</wp14:pctHeight>
-                      </wp14:sizeRelV>
-                    </wp:anchor>
+                            </ns6:txbx>
+                            <ns6:bodyPr rot="0" vert="horz" wrap="square" lIns="91440" tIns="45720" rIns="91440" bIns="45720" anchor="t" anchorCtr="0">
+                              <ns5:noAutofit/>
+                            </ns6:bodyPr>
+                          </ns6:wsp>
+                        </ns5:graphicData>
+                      </ns5:graphic>
+                      <ns4:sizeRelH relativeFrom="margin">
+                        <ns4:pctWidth>0</ns4:pctWidth>
+                      </ns4:sizeRelH>
+                      <ns4:sizeRelV relativeFrom="margin">
+                        <ns4:pctHeight>0</ns4:pctHeight>
+                      </ns4:sizeRelV>
+                    </ns3:anchor>
                   </w:drawing>
-                </mc:Choice>
-                <mc:Fallback>
+                </ns1:Choice>
+                <ns1:Fallback>
                   <w:pict>
-                    <v:shape w14:anchorId="3245D485" id="_x0000_s1029" type="#_x0000_t202" style="position:absolute;left:0;text-align:left;margin-left:2.3pt;margin-top:-5.05pt;width:130pt;height:17.5pt;z-index:251661317;visibility:visible;mso-wrap-style:square;mso-width-percent:0;mso-height-percent:0;mso-wrap-distance-left:9pt;mso-wrap-distance-top:3.6pt;mso-wrap-distance-right:9pt;mso-wrap-distance-bottom:3.6pt;mso-position-horizontal:absolute;mso-position-horizontal-relative:margin;mso-position-vertical:absolute;mso-position-vertical-relative:text;mso-width-percent:0;mso-height-percent:0;mso-width-relative:margin;mso-height-relative:margin;v-text-anchor:top" o:gfxdata="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" stroked="f">
-                      <v:textbox>
+                    <ns7:shape ns2:anchorId="3245D485" id="_x0000_s1029" type="#_x0000_t202" style="position:absolute;left:0;text-align:left;margin-left:2.3pt;margin-top:-5.05pt;width:130pt;height:17.5pt;z-index:251661317;visibility:visible;mso-wrap-style:square;mso-width-percent:0;mso-height-percent:0;mso-wrap-distance-left:9pt;mso-wrap-distance-top:3.6pt;mso-wrap-distance-right:9pt;mso-wrap-distance-bottom:3.6pt;mso-position-horizontal:absolute;mso-position-horizontal-relative:margin;mso-position-vertical:absolute;mso-position-vertical-relative:text;mso-width-percent:0;mso-height-percent:0;mso-width-relative:margin;mso-height-relative:margin;v-text-anchor:top" ns8:gfxdata="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" stroked="f">
+                      <ns7:textbox>
                         <w:txbxContent>
-                          <w:p>
+                          <w:p ns2:paraId="0C71AE25" ns2:textId="77777777">
                             <w:pPr>
                               <w:rPr>
                                 <w:b/>
@@ -6956,19 +6956,19 @@
                                 <w:szCs w:val="16"/>
                                 <w:highlight w:val="yellow"/>
                               </w:rPr>
-                              <w:t>Variable 11</w:t>
+                              <w:t>[Hostel Telephone]</w:t>
                             </w:r>
                           </w:p>
                         </w:txbxContent>
-                      </v:textbox>
-                      <w10:wrap anchorx="margin"/>
-                    </v:shape>
+                      </ns7:textbox>
+                      <ns9:wrap anchorx="margin"/>
+                    </ns7:shape>
                   </w:pict>
-                </mc:Fallback>
-              </mc:AlternateContent>
-            </w:r>
-            <w:r>
-              <w:t xml:space="preserve">Page </w:t>
+                </ns1:Fallback>
+              </ns1:AlternateContent>
+            </w:r>
+            <w:r>
+              <w:t xml:space="preserve"/>
             </w:r>
             <w:r>
               <w:rPr>
@@ -7014,7 +7014,7 @@
               <w:fldChar w:fldCharType="end"/>
             </w:r>
             <w:r>
-              <w:t xml:space="preserve"> of </w:t>
+              <w:t xml:space="preserve"> of Page </w:t>
             </w:r>
             <w:r>
               <w:rPr>
@@ -7064,7 +7064,7 @@
       </w:sdt>
     </w:sdtContent>
   </w:sdt>
-  <w:p>
+  <w:p ns2:paraId="5BBF9FE6" ns2:textId="77777777">
     <w:pPr>
       <w:pStyle w:val="Footer"/>
     </w:pPr>
@@ -7073,7 +7073,7 @@
 </file>
 
 <file path=word/footer2.xml><?xml version="1.0" encoding="utf-8"?>
-<w:ftr xmlns:wpc="http://schemas.microsoft.com/office/word/2010/wordprocessingCanvas" xmlns:cx="http://schemas.microsoft.com/office/drawing/2014/chartex" xmlns:cx1="http://schemas.microsoft.com/office/drawing/2015/9/8/chartex" xmlns:cx2="http://schemas.microsoft.com/office/drawing/2015/10/21/chartex" xmlns:cx3="http://schemas.microsoft.com/office/drawing/2016/5/9/chartex" xmlns:cx4="http://schemas.microsoft.com/office/drawing/2016/5/10/chartex" xmlns:cx5="http://schemas.microsoft.com/office/drawing/2016/5/11/chartex" xmlns:cx6="http://schemas.microsoft.com/office/drawing/2016/5/12/chartex" xmlns:cx7="http://schemas.microsoft.com/office/drawing/2016/5/13/chartex" xmlns:cx8="http://schemas.microsoft.com/office/drawing/2016/5/14/chartex" xmlns:mc="http://schemas.openxmlformats.org/markup-compatibility/2006" xmlns:aink="http://schemas.microsoft.com/office/drawing/2016/ink" xmlns:am3d="http://schemas.microsoft.com/office/drawing/2017/model3d" xmlns:o="urn:schemas-microsoft-com:office:office" xmlns:oel="http://schemas.microsoft.com/office/2019/extlst" xmlns:r="http://schemas.openxmlformats.org/officeDocument/2006/relationships" xmlns:m="http://schemas.openxmlformats.org/officeDocument/2006/math" xmlns:v="urn:schemas-microsoft-com:vml" xmlns:wp14="http://schemas.microsoft.com/office/word/2010/wordprocessingDrawing" xmlns:wp="http://schemas.openxmlformats.org/drawingml/2006/wordprocessingDrawing" xmlns:w10="urn:schemas-microsoft-com:office:word" xmlns:w="http://schemas.openxmlformats.org/wordprocessingml/2006/main" xmlns:w14="http://schemas.microsoft.com/office/word/2010/wordml" xmlns:w15="http://schemas.microsoft.com/office/word/2012/wordml" xmlns:w16cex="http://schemas.microsoft.com/office/word/2018/wordml/cex" xmlns:w16cid="http://schemas.microsoft.com/office/word/2016/wordml/cid" xmlns:w16="http://schemas.microsoft.com/office/word/2018/wordml" xmlns:w16du="http://schemas.microsoft.com/office/word/2023/wordml/word16du" xmlns:w16sdtdh="http://schemas.microsoft.com/office/word/2020/wordml/sdtdatahash" xmlns:w16sdtfl="http://schemas.microsoft.com/office/word/2024/wordml/sdtformatlock" xmlns:w16se="http://schemas.microsoft.com/office/word/2015/wordml/symex" xmlns:wpg="http://schemas.microsoft.com/office/word/2010/wordprocessingGroup" xmlns:wpi="http://schemas.microsoft.com/office/word/2010/wordprocessingInk" xmlns:wne="http://schemas.microsoft.com/office/word/2006/wordml" xmlns:wps="http://schemas.microsoft.com/office/word/2010/wordprocessingShape" mc:Ignorable="w14 w15 w16se w16cid w16 w16cex w16sdtdh w16sdtfl w16du wp14">
+<w:ftr xmlns:ns1="http://schemas.openxmlformats.org/markup-compatibility/2006" xmlns:ns2="http://schemas.microsoft.com/office/word/2010/wordml" xmlns:ns3="http://schemas.openxmlformats.org/drawingml/2006/wordprocessingDrawing" xmlns:ns4="http://schemas.microsoft.com/office/word/2010/wordprocessingDrawing" xmlns:ns5="http://schemas.openxmlformats.org/drawingml/2006/main" xmlns:ns6="http://schemas.microsoft.com/office/word/2010/wordprocessingShape" xmlns:ns7="urn:schemas-microsoft-com:vml" xmlns:ns8="urn:schemas-microsoft-com:office:office" xmlns:ns9="urn:schemas-microsoft-com:office:word" xmlns:w="http://schemas.openxmlformats.org/wordprocessingml/2006/main" ns1:Ignorable="w14 w15 w16se w16cid w16 w16cex w16sdtdh w16sdtfl w16du wp14">
   <w:sdt>
     <w:sdtPr>
       <w:id w:val="-469134945"/>
@@ -7092,7 +7092,7 @@
           </w:docPartObj>
         </w:sdtPr>
         <w:sdtContent>
-          <w:p>
+          <w:p ns2:paraId="330E638C" ns2:textId="4284E6F6">
             <w:pPr>
               <w:pStyle w:val="Footer"/>
               <w:jc w:val="center"/>
@@ -7101,51 +7101,51 @@
               <w:rPr>
                 <w:noProof/>
               </w:rPr>
-              <mc:AlternateContent>
-                <mc:Choice Requires="wps">
+              <ns1:AlternateContent>
+                <ns1:Choice Requires="wps">
                   <w:drawing>
-                    <wp:anchor distT="45720" distB="45720" distL="114300" distR="114300" simplePos="0" relativeHeight="251658244" behindDoc="0" locked="0" layoutInCell="1" allowOverlap="1" wp14:anchorId="1F74D7F9" wp14:editId="4E923C10">
-                      <wp:simplePos x="0" y="0"/>
-                      <wp:positionH relativeFrom="column">
-                        <wp:posOffset>3778885</wp:posOffset>
-                      </wp:positionH>
-                      <wp:positionV relativeFrom="paragraph">
-                        <wp:posOffset>-53340</wp:posOffset>
-                      </wp:positionV>
-                      <wp:extent cx="1651000" cy="222250"/>
-                      <wp:effectExtent l="0" t="0" r="6350" b="6350"/>
-                      <wp:wrapNone/>
-                      <wp:docPr id="293392876" name="Text Box 2"/>
-                      <wp:cNvGraphicFramePr>
-                        <a:graphicFrameLocks xmlns:a="http://schemas.openxmlformats.org/drawingml/2006/main"/>
-                      </wp:cNvGraphicFramePr>
-                      <a:graphic xmlns:a="http://schemas.openxmlformats.org/drawingml/2006/main">
-                        <a:graphicData uri="http://schemas.microsoft.com/office/word/2010/wordprocessingShape">
-                          <wps:wsp>
-                            <wps:cNvSpPr txBox="1">
-                              <a:spLocks noChangeArrowheads="1"/>
-                            </wps:cNvSpPr>
-                            <wps:spPr bwMode="auto">
-                              <a:xfrm>
-                                <a:off x="0" y="0"/>
-                                <a:ext cx="1651000" cy="222250"/>
-                              </a:xfrm>
-                              <a:prstGeom prst="rect">
-                                <a:avLst/>
-                              </a:prstGeom>
-                              <a:solidFill>
-                                <a:srgbClr val="FFFFFF"/>
-                              </a:solidFill>
-                              <a:ln w="9525">
-                                <a:noFill/>
-                                <a:miter lim="800000"/>
-                                <a:headEnd/>
-                                <a:tailEnd/>
-                              </a:ln>
-                            </wps:spPr>
-                            <wps:txbx>
+                    <ns3:anchor distT="45720" distB="45720" distL="114300" distR="114300" simplePos="0" relativeHeight="251658244" behindDoc="0" locked="0" layoutInCell="1" allowOverlap="1" ns4:anchorId="1F74D7F9" ns4:editId="4E923C10">
+                      <ns3:simplePos x="0" y="0"/>
+                      <ns3:positionH relativeFrom="column">
+                        <ns3:posOffset>3778885</ns3:posOffset>
+                      </ns3:positionH>
+                      <ns3:positionV relativeFrom="paragraph">
+                        <ns3:posOffset>-53340</ns3:posOffset>
+                      </ns3:positionV>
+                      <ns3:extent cx="1651000" cy="222250"/>
+                      <ns3:effectExtent l="0" t="0" r="6350" b="6350"/>
+                      <ns3:wrapNone/>
+                      <ns3:docPr id="293392876" name="Text Box 2"/>
+                      <ns3:cNvGraphicFramePr>
+                        <ns5:graphicFrameLocks/>
+                      </ns3:cNvGraphicFramePr>
+                      <ns5:graphic>
+                        <ns5:graphicData uri="http://schemas.microsoft.com/office/word/2010/wordprocessingShape">
+                          <ns6:wsp>
+                            <ns6:cNvSpPr txBox="1">
+                              <ns5:spLocks noChangeArrowheads="1"/>
+                            </ns6:cNvSpPr>
+                            <ns6:spPr bwMode="auto">
+                              <ns5:xfrm>
+                                <ns5:off x="0" y="0"/>
+                                <ns5:ext cx="1651000" cy="222250"/>
+                              </ns5:xfrm>
+                              <ns5:prstGeom prst="rect">
+                                <ns5:avLst/>
+                              </ns5:prstGeom>
+                              <ns5:solidFill>
+                                <ns5:srgbClr val="FFFFFF"/>
+                              </ns5:solidFill>
+                              <ns5:ln w="9525">
+                                <ns5:noFill/>
+                                <ns5:miter lim="800000"/>
+                                <ns5:headEnd/>
+                                <ns5:tailEnd/>
+                              </ns5:ln>
+                            </ns6:spPr>
+                            <ns6:txbx>
                               <w:txbxContent>
-                                <w:p>
+                                <w:p ns2:paraId="76BD3AA2" ns2:textId="6455AD9A">
                                   <w:pPr>
                                     <w:rPr>
                                       <w:sz w:val="16"/>
@@ -7169,7 +7169,7 @@
                                       <w:szCs w:val="16"/>
                                       <w:highlight w:val="yellow"/>
                                     </w:rPr>
-                                    <w:t xml:space="preserve">Variable </w:t>
+                                    <w:t xml:space="preserve">[Hostel Email]</w:t>
                                   </w:r>
                                   <w:r>
                                     <w:rPr>
@@ -7179,7 +7179,7 @@
                                       <w:szCs w:val="16"/>
                                       <w:highlight w:val="yellow"/>
                                     </w:rPr>
-                                    <w:t>1</w:t>
+                                    <w:t/>
                                   </w:r>
                                   <w:r>
                                     <w:rPr>
@@ -7189,36 +7189,36 @@
                                       <w:szCs w:val="16"/>
                                       <w:highlight w:val="yellow"/>
                                     </w:rPr>
-                                    <w:t>2</w:t>
+                                    <w:t/>
                                   </w:r>
                                 </w:p>
                               </w:txbxContent>
-                            </wps:txbx>
-                            <wps:bodyPr rot="0" vert="horz" wrap="square" lIns="91440" tIns="45720" rIns="91440" bIns="45720" anchor="t" anchorCtr="0">
-                              <a:noAutofit/>
-                            </wps:bodyPr>
-                          </wps:wsp>
-                        </a:graphicData>
-                      </a:graphic>
-                      <wp14:sizeRelH relativeFrom="margin">
-                        <wp14:pctWidth>0</wp14:pctWidth>
-                      </wp14:sizeRelH>
-                      <wp14:sizeRelV relativeFrom="margin">
-                        <wp14:pctHeight>0</wp14:pctHeight>
-                      </wp14:sizeRelV>
-                    </wp:anchor>
+                            </ns6:txbx>
+                            <ns6:bodyPr rot="0" vert="horz" wrap="square" lIns="91440" tIns="45720" rIns="91440" bIns="45720" anchor="t" anchorCtr="0">
+                              <ns5:noAutofit/>
+                            </ns6:bodyPr>
+                          </ns6:wsp>
+                        </ns5:graphicData>
+                      </ns5:graphic>
+                      <ns4:sizeRelH relativeFrom="margin">
+                        <ns4:pctWidth>0</ns4:pctWidth>
+                      </ns4:sizeRelH>
+                      <ns4:sizeRelV relativeFrom="margin">
+                        <ns4:pctHeight>0</ns4:pctHeight>
+                      </ns4:sizeRelV>
+                    </ns3:anchor>
                   </w:drawing>
-                </mc:Choice>
-                <mc:Fallback>
+                </ns1:Choice>
+                <ns1:Fallback>
                   <w:pict>
-                    <v:shapetype w14:anchorId="1F74D7F9" id="_x0000_t202" coordsize="21600,21600" o:spt="202" path="m,l,21600r21600,l21600,xe">
-                      <v:stroke joinstyle="miter"/>
-                      <v:path gradientshapeok="t" o:connecttype="rect"/>
-                    </v:shapetype>
-                    <v:shape id="_x0000_s1030" type="#_x0000_t202" style="position:absolute;left:0;text-align:left;margin-left:297.55pt;margin-top:-4.2pt;width:130pt;height:17.5pt;z-index:251658244;visibility:visible;mso-wrap-style:square;mso-width-percent:0;mso-height-percent:0;mso-wrap-distance-left:9pt;mso-wrap-distance-top:3.6pt;mso-wrap-distance-right:9pt;mso-wrap-distance-bottom:3.6pt;mso-position-horizontal:absolute;mso-position-horizontal-relative:text;mso-position-vertical:absolute;mso-position-vertical-relative:text;mso-width-percent:0;mso-height-percent:0;mso-width-relative:margin;mso-height-relative:margin;v-text-anchor:top" o:gfxdata="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" stroked="f">
-                      <v:textbox>
+                    <ns7:shapetype ns2:anchorId="1F74D7F9" id="_x0000_t202" coordsize="21600,21600" ns8:spt="202" path="m,l,21600r21600,l21600,xe">
+                      <ns7:stroke joinstyle="miter"/>
+                      <ns7:path gradientshapeok="t" ns8:connecttype="rect"/>
+                    </ns7:shapetype>
+                    <ns7:shape id="_x0000_s1030" type="#_x0000_t202" style="position:absolute;left:0;text-align:left;margin-left:297.55pt;margin-top:-4.2pt;width:130pt;height:17.5pt;z-index:251658244;visibility:visible;mso-wrap-style:square;mso-width-percent:0;mso-height-percent:0;mso-wrap-distance-left:9pt;mso-wrap-distance-top:3.6pt;mso-wrap-distance-right:9pt;mso-wrap-distance-bottom:3.6pt;mso-position-horizontal:absolute;mso-position-horizontal-relative:text;mso-position-vertical:absolute;mso-position-vertical-relative:text;mso-width-percent:0;mso-height-percent:0;mso-width-relative:margin;mso-height-relative:margin;v-text-anchor:top" ns8:gfxdata="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" stroked="f">
+                      <ns7:textbox>
                         <w:txbxContent>
-                          <w:p>
+                          <w:p ns2:paraId="76BD3AA2" ns2:textId="6455AD9A">
                             <w:pPr>
                               <w:rPr>
                                 <w:sz w:val="16"/>
@@ -7242,7 +7242,7 @@
                                 <w:szCs w:val="16"/>
                                 <w:highlight w:val="yellow"/>
                               </w:rPr>
-                              <w:t xml:space="preserve">Variable </w:t>
+                              <w:t xml:space="preserve">[Hostel Email]</w:t>
                             </w:r>
                             <w:r>
                               <w:rPr>
@@ -7252,7 +7252,7 @@
                                 <w:szCs w:val="16"/>
                                 <w:highlight w:val="yellow"/>
                               </w:rPr>
-                              <w:t>1</w:t>
+                              <w:t/>
                             </w:r>
                             <w:r>
                               <w:rPr>
@@ -7262,65 +7262,65 @@
                                 <w:szCs w:val="16"/>
                                 <w:highlight w:val="yellow"/>
                               </w:rPr>
-                              <w:t>2</w:t>
+                              <w:t/>
                             </w:r>
                           </w:p>
                         </w:txbxContent>
-                      </v:textbox>
-                    </v:shape>
+                      </ns7:textbox>
+                    </ns7:shape>
                   </w:pict>
-                </mc:Fallback>
-              </mc:AlternateContent>
+                </ns1:Fallback>
+              </ns1:AlternateContent>
             </w:r>
             <w:r>
               <w:rPr>
                 <w:noProof/>
               </w:rPr>
-              <mc:AlternateContent>
-                <mc:Choice Requires="wps">
+              <ns1:AlternateContent>
+                <ns1:Choice Requires="wps">
                   <w:drawing>
-                    <wp:anchor distT="45720" distB="45720" distL="114300" distR="114300" simplePos="0" relativeHeight="251658245" behindDoc="0" locked="0" layoutInCell="1" allowOverlap="1" wp14:anchorId="4AC38046" wp14:editId="07216774">
-                      <wp:simplePos x="0" y="0"/>
-                      <wp:positionH relativeFrom="margin">
-                        <wp:posOffset>29210</wp:posOffset>
-                      </wp:positionH>
-                      <wp:positionV relativeFrom="paragraph">
-                        <wp:posOffset>-64135</wp:posOffset>
-                      </wp:positionV>
-                      <wp:extent cx="1651000" cy="222250"/>
-                      <wp:effectExtent l="0" t="0" r="6350" b="6350"/>
-                      <wp:wrapNone/>
-                      <wp:docPr id="919953751" name="Text Box 2"/>
-                      <wp:cNvGraphicFramePr>
-                        <a:graphicFrameLocks xmlns:a="http://schemas.openxmlformats.org/drawingml/2006/main"/>
-                      </wp:cNvGraphicFramePr>
-                      <a:graphic xmlns:a="http://schemas.openxmlformats.org/drawingml/2006/main">
-                        <a:graphicData uri="http://schemas.microsoft.com/office/word/2010/wordprocessingShape">
-                          <wps:wsp>
-                            <wps:cNvSpPr txBox="1">
-                              <a:spLocks noChangeArrowheads="1"/>
-                            </wps:cNvSpPr>
-                            <wps:spPr bwMode="auto">
-                              <a:xfrm>
-                                <a:off x="0" y="0"/>
-                                <a:ext cx="1651000" cy="222250"/>
-                              </a:xfrm>
-                              <a:prstGeom prst="rect">
-                                <a:avLst/>
-                              </a:prstGeom>
-                              <a:solidFill>
-                                <a:srgbClr val="FFFFFF"/>
-                              </a:solidFill>
-                              <a:ln w="9525">
-                                <a:noFill/>
-                                <a:miter lim="800000"/>
-                                <a:headEnd/>
-                                <a:tailEnd/>
-                              </a:ln>
-                            </wps:spPr>
-                            <wps:txbx>
+                    <ns3:anchor distT="45720" distB="45720" distL="114300" distR="114300" simplePos="0" relativeHeight="251658245" behindDoc="0" locked="0" layoutInCell="1" allowOverlap="1" ns4:anchorId="4AC38046" ns4:editId="07216774">
+                      <ns3:simplePos x="0" y="0"/>
+                      <ns3:positionH relativeFrom="margin">
+                        <ns3:posOffset>29210</ns3:posOffset>
+                      </ns3:positionH>
+                      <ns3:positionV relativeFrom="paragraph">
+                        <ns3:posOffset>-64135</ns3:posOffset>
+                      </ns3:positionV>
+                      <ns3:extent cx="1651000" cy="222250"/>
+                      <ns3:effectExtent l="0" t="0" r="6350" b="6350"/>
+                      <ns3:wrapNone/>
+                      <ns3:docPr id="919953751" name="Text Box 2"/>
+                      <ns3:cNvGraphicFramePr>
+                        <ns5:graphicFrameLocks/>
+                      </ns3:cNvGraphicFramePr>
+                      <ns5:graphic>
+                        <ns5:graphicData uri="http://schemas.microsoft.com/office/word/2010/wordprocessingShape">
+                          <ns6:wsp>
+                            <ns6:cNvSpPr txBox="1">
+                              <ns5:spLocks noChangeArrowheads="1"/>
+                            </ns6:cNvSpPr>
+                            <ns6:spPr bwMode="auto">
+                              <ns5:xfrm>
+                                <ns5:off x="0" y="0"/>
+                                <ns5:ext cx="1651000" cy="222250"/>
+                              </ns5:xfrm>
+                              <ns5:prstGeom prst="rect">
+                                <ns5:avLst/>
+                              </ns5:prstGeom>
+                              <ns5:solidFill>
+                                <ns5:srgbClr val="FFFFFF"/>
+                              </ns5:solidFill>
+                              <ns5:ln w="9525">
+                                <ns5:noFill/>
+                                <ns5:miter lim="800000"/>
+                                <ns5:headEnd/>
+                                <ns5:tailEnd/>
+                              </ns5:ln>
+                            </ns6:spPr>
+                            <ns6:txbx>
                               <w:txbxContent>
-                                <w:p>
+                                <w:p ns2:paraId="3213C800" ns2:textId="000DD499">
                                   <w:pPr>
                                     <w:rPr>
                                       <w:b/>
@@ -7346,32 +7346,32 @@
                                       <w:szCs w:val="16"/>
                                       <w:highlight w:val="yellow"/>
                                     </w:rPr>
-                                    <w:t>Variable 11</w:t>
+                                    <w:t>[Hostel Telephone]</w:t>
                                   </w:r>
                                 </w:p>
                               </w:txbxContent>
-                            </wps:txbx>
-                            <wps:bodyPr rot="0" vert="horz" wrap="square" lIns="91440" tIns="45720" rIns="91440" bIns="45720" anchor="t" anchorCtr="0">
-                              <a:noAutofit/>
-                            </wps:bodyPr>
-                          </wps:wsp>
-                        </a:graphicData>
-                      </a:graphic>
-                      <wp14:sizeRelH relativeFrom="margin">
-                        <wp14:pctWidth>0</wp14:pctWidth>
-                      </wp14:sizeRelH>
-                      <wp14:sizeRelV relativeFrom="margin">
-                        <wp14:pctHeight>0</wp14:pctHeight>
-                      </wp14:sizeRelV>
-                    </wp:anchor>
+                            </ns6:txbx>
+                            <ns6:bodyPr rot="0" vert="horz" wrap="square" lIns="91440" tIns="45720" rIns="91440" bIns="45720" anchor="t" anchorCtr="0">
+                              <ns5:noAutofit/>
+                            </ns6:bodyPr>
+                          </ns6:wsp>
+                        </ns5:graphicData>
+                      </ns5:graphic>
+                      <ns4:sizeRelH relativeFrom="margin">
+                        <ns4:pctWidth>0</ns4:pctWidth>
+                      </ns4:sizeRelH>
+                      <ns4:sizeRelV relativeFrom="margin">
+                        <ns4:pctHeight>0</ns4:pctHeight>
+                      </ns4:sizeRelV>
+                    </ns3:anchor>
                   </w:drawing>
-                </mc:Choice>
-                <mc:Fallback>
+                </ns1:Choice>
+                <ns1:Fallback>
                   <w:pict>
-                    <v:shape w14:anchorId="4AC38046" id="_x0000_s1031" type="#_x0000_t202" style="position:absolute;left:0;text-align:left;margin-left:2.3pt;margin-top:-5.05pt;width:130pt;height:17.5pt;z-index:251658245;visibility:visible;mso-wrap-style:square;mso-width-percent:0;mso-height-percent:0;mso-wrap-distance-left:9pt;mso-wrap-distance-top:3.6pt;mso-wrap-distance-right:9pt;mso-wrap-distance-bottom:3.6pt;mso-position-horizontal:absolute;mso-position-horizontal-relative:margin;mso-position-vertical:absolute;mso-position-vertical-relative:text;mso-width-percent:0;mso-height-percent:0;mso-width-relative:margin;mso-height-relative:margin;v-text-anchor:top" o:gfxdata="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" stroked="f">
-                      <v:textbox>
+                    <ns7:shape ns2:anchorId="4AC38046" id="_x0000_s1031" type="#_x0000_t202" style="position:absolute;left:0;text-align:left;margin-left:2.3pt;margin-top:-5.05pt;width:130pt;height:17.5pt;z-index:251658245;visibility:visible;mso-wrap-style:square;mso-width-percent:0;mso-height-percent:0;mso-wrap-distance-left:9pt;mso-wrap-distance-top:3.6pt;mso-wrap-distance-right:9pt;mso-wrap-distance-bottom:3.6pt;mso-position-horizontal:absolute;mso-position-horizontal-relative:margin;mso-position-vertical:absolute;mso-position-vertical-relative:text;mso-width-percent:0;mso-height-percent:0;mso-width-relative:margin;mso-height-relative:margin;v-text-anchor:top" ns8:gfxdata="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" stroked="f">
+                      <ns7:textbox>
                         <w:txbxContent>
-                          <w:p>
+                          <w:p ns2:paraId="3213C800" ns2:textId="000DD499">
                             <w:pPr>
                               <w:rPr>
                                 <w:b/>
@@ -7397,19 +7397,19 @@
                                 <w:szCs w:val="16"/>
                                 <w:highlight w:val="yellow"/>
                               </w:rPr>
-                              <w:t>Variable 11</w:t>
+                              <w:t>[Hostel Telephone]</w:t>
                             </w:r>
                           </w:p>
                         </w:txbxContent>
-                      </v:textbox>
-                      <w10:wrap anchorx="margin"/>
-                    </v:shape>
+                      </ns7:textbox>
+                      <ns9:wrap anchorx="margin"/>
+                    </ns7:shape>
                   </w:pict>
-                </mc:Fallback>
-              </mc:AlternateContent>
-            </w:r>
-            <w:r>
-              <w:t xml:space="preserve">Page </w:t>
+                </ns1:Fallback>
+              </ns1:AlternateContent>
+            </w:r>
+            <w:r>
+              <w:t xml:space="preserve"/>
             </w:r>
             <w:r>
               <w:rPr>
@@ -7454,7 +7454,7 @@
               <w:fldChar w:fldCharType="end"/>
             </w:r>
             <w:r>
-              <w:t xml:space="preserve"> of </w:t>
+              <w:t xml:space="preserve"> of Page </w:t>
             </w:r>
             <w:r>
               <w:rPr>
@@ -7503,7 +7503,7 @@
       </w:sdt>
     </w:sdtContent>
   </w:sdt>
-  <w:p>
+  <w:p ns2:paraId="4A0DBD89" ns2:textId="77777777">
     <w:pPr>
       <w:pStyle w:val="Footer"/>
     </w:pPr>

</xml_diff>

<commit_message>
Correct agreement signature spacing
</commit_message>
<xml_diff>
--- a/front/public/Agreement-Template.docx
+++ b/front/public/Agreement-Template.docx
@@ -3439,13 +3439,13 @@
     </w:p>
     <w:p ns2:paraId="6A2308F3" ns2:textId="77777777">
       <w:pPr>
-        <w:spacing w:before="0" w:after="0"/>
+        <w:spacing w:before="0" w:after="0" w:line="355" w:lineRule="exact"/>
         <w:jc w:val="both"/>
       </w:pPr>
     </w:p>
     <w:p ns2:paraId="1D1E02EC" ns2:textId="77777777">
       <w:pPr>
-        <w:spacing w:before="0" w:after="0"/>
+        <w:spacing w:before="240" w:after="0"/>
         <w:jc w:val="both"/>
       </w:pPr>
       <w:r>

</xml_diff>